<commit_message>
`Stabilizza selettore documenti e stampa mappa da Azioni`
</commit_message>
<xml_diff>
--- a/your-extensions/widgets/_shared/gii-anteprime/documenti-tecnici/rapporto/rapporto-template.docx
+++ b/your-extensions/widgets/_shared/gii-anteprime/documenti-tecnici/rapporto/rapporto-template.docx
@@ -275,6 +275,84 @@
               </w:rPr>
             </w:pPr>
           </w:p>
+          <w:p>
+            <w:pPr>
+              <w:jc w:val="center"/>
+              <w:rPr>
+                <w:rFonts w:ascii="Calibri" w:eastAsia="Calibri" w:hAnsi="Calibri" w:cs="Calibri"/>
+                <w:b/>
+                <w:bCs/>
+                <w:color w:val="005B8C"/>
+                <w:sz w:val="20"/>
+                <w:szCs w:val="20"/>
+              </w:rPr>
+            </w:pPr>
+          </w:p>
+          <w:p>
+            <w:pPr>
+              <w:jc w:val="center"/>
+              <w:rPr>
+                <w:rFonts w:ascii="Calibri" w:eastAsia="Calibri" w:hAnsi="Calibri" w:cs="Calibri"/>
+                <w:b/>
+                <w:bCs/>
+                <w:color w:val="005B8C"/>
+                <w:sz w:val="20"/>
+                <w:szCs w:val="20"/>
+              </w:rPr>
+            </w:pPr>
+          </w:p>
+          <w:p>
+            <w:pPr>
+              <w:jc w:val="center"/>
+              <w:rPr>
+                <w:rFonts w:ascii="Calibri" w:eastAsia="Calibri" w:hAnsi="Calibri" w:cs="Calibri"/>
+                <w:b/>
+                <w:bCs/>
+                <w:color w:val="005B8C"/>
+                <w:sz w:val="20"/>
+                <w:szCs w:val="20"/>
+              </w:rPr>
+            </w:pPr>
+          </w:p>
+          <w:p>
+            <w:pPr>
+              <w:jc w:val="center"/>
+              <w:rPr>
+                <w:rFonts w:ascii="Calibri" w:eastAsia="Calibri" w:hAnsi="Calibri" w:cs="Calibri"/>
+                <w:b/>
+                <w:bCs/>
+                <w:color w:val="005B8C"/>
+                <w:sz w:val="20"/>
+                <w:szCs w:val="20"/>
+              </w:rPr>
+            </w:pPr>
+          </w:p>
+          <w:p>
+            <w:pPr>
+              <w:jc w:val="center"/>
+              <w:rPr>
+                <w:rFonts w:ascii="Calibri" w:eastAsia="Calibri" w:hAnsi="Calibri" w:cs="Calibri"/>
+                <w:b/>
+                <w:bCs/>
+                <w:color w:val="005B8C"/>
+                <w:sz w:val="20"/>
+                <w:szCs w:val="20"/>
+              </w:rPr>
+            </w:pPr>
+          </w:p>
+          <w:p>
+            <w:pPr>
+              <w:jc w:val="center"/>
+              <w:rPr>
+                <w:rFonts w:ascii="Calibri" w:eastAsia="Calibri" w:hAnsi="Calibri" w:cs="Calibri"/>
+                <w:b/>
+                <w:bCs/>
+                <w:color w:val="005B8C"/>
+                <w:sz w:val="20"/>
+                <w:szCs w:val="20"/>
+              </w:rPr>
+            </w:pPr>
+          </w:p>
         </w:tc>
       </w:tr>
       <w:tr>
@@ -618,7 +696,7 @@
                 <w:sz w:val="20"/>
                 <w:szCs w:val="20"/>
               </w:rPr>
-              <w:t>SUPERFICI (m</w:t>
+              <w:t>SUPERFICI (</w:t>
             </w:r>
             <w:r>
               <w:rPr>
@@ -628,9 +706,8 @@
                 <w:color w:val="FFFFFF" w:themeColor="background1"/>
                 <w:sz w:val="20"/>
                 <w:szCs w:val="20"/>
-                <w:vertAlign w:val="superscript"/>
-              </w:rPr>
-              <w:t>2</w:t>
+              </w:rPr>
+              <w:t>ha.a.ca</w:t>
             </w:r>
             <w:r>
               <w:rPr>
@@ -1592,7 +1669,7 @@
       </w:tr>
       <w:tr>
         <w:trPr>
-          <w:trHeight w:hRule="exact" w:val="624"/>
+          <w:trHeight w:hRule="exact" w:val="340"/>
           <w:jc w:val="right"/>
         </w:trPr>
         <w:tc>
@@ -1647,14 +1724,6 @@
                 <w:szCs w:val="20"/>
               </w:rPr>
               <w:t>Presentazione tardiva comunicazione di irrigazione</w:t>
-            </w:r>
-            <w:r>
-              <w:rPr>
-                <w:rFonts w:ascii="Calibri" w:hAnsi="Calibri" w:cs="Calibri"/>
-                <w:color w:val="005B8C"/>
-                <w:sz w:val="20"/>
-                <w:szCs w:val="20"/>
-              </w:rPr>
             </w:r>
           </w:p>
         </w:tc>
@@ -1790,7 +1859,7 @@
       </w:tr>
       <w:tr>
         <w:trPr>
-          <w:trHeight w:hRule="exact" w:val="623"/>
+          <w:trHeight w:hRule="exact" w:val="340"/>
           <w:jc w:val="right"/>
         </w:trPr>
         <w:tc>
@@ -1833,16 +1902,16 @@
               <w:rPr>
                 <w:rFonts w:ascii="Calibri" w:hAnsi="Calibri" w:cs="Calibri"/>
                 <w:color w:val="005B8C"/>
-                <w:sz w:val="20"/>
-                <w:szCs w:val="20"/>
-              </w:rPr>
-            </w:pPr>
-            <w:r>
-              <w:rPr>
-                <w:rFonts w:ascii="Calibri" w:hAnsi="Calibri" w:cs="Calibri"/>
-                <w:color w:val="005B8C"/>
-                <w:sz w:val="20"/>
-                <w:szCs w:val="20"/>
+                <w:sz w:val="16"/>
+                <w:szCs w:val="16"/>
+              </w:rPr>
+            </w:pPr>
+            <w:r>
+              <w:rPr>
+                <w:rFonts w:ascii="Calibri" w:hAnsi="Calibri" w:cs="Calibri"/>
+                <w:color w:val="005B8C"/>
+                <w:sz w:val="16"/>
+                <w:szCs w:val="16"/>
               </w:rPr>
               <w:t>Presentazione tardiva comunicazione di variazione o di rinuncia</w:t>
             </w:r>
@@ -4644,7 +4713,7 @@
       </w:tr>
       <w:tr>
         <w:trPr>
-          <w:trHeight w:hRule="exact" w:val="1871"/>
+          <w:trHeight w:hRule="exact" w:val="2041"/>
           <w:jc w:val="right"/>
         </w:trPr>
         <w:tc>
@@ -4714,7 +4783,7 @@
       </w:tr>
       <w:tr>
         <w:trPr>
-          <w:trHeight w:hRule="exact" w:val="1871"/>
+          <w:trHeight w:hRule="exact" w:val="2041"/>
           <w:jc w:val="right"/>
         </w:trPr>
         <w:tc>
@@ -4783,7 +4852,7 @@
       </w:tr>
       <w:tr>
         <w:trPr>
-          <w:trHeight w:hRule="exact" w:val="1871"/>
+          <w:trHeight w:hRule="exact" w:val="2041"/>
           <w:jc w:val="right"/>
         </w:trPr>
         <w:tc>
@@ -5597,70 +5666,6 @@
         <w:tc>
           <w:tcPr>
             <w:tcW w:w="900" w:type="dxa"/>
-            <w:tcMar>
-              <w:top w:w="79" w:type="dxa"/>
-              <w:left w:w="57" w:type="dxa"/>
-              <w:bottom w:w="79" w:type="dxa"/>
-              <w:right w:w="57" w:type="dxa"/>
-            </w:tcMar>
-            <w:vAlign w:val="center"/>
-          </w:tcPr>
-          <w:p>
-            <w:pPr>
-              <w:rPr>
-                <w:rFonts w:ascii="Calibri" w:hAnsi="Calibri" w:cs="Calibri"/>
-                <w:color w:val="005B8C"/>
-                <w:sz w:val="20"/>
-                <w:szCs w:val="20"/>
-              </w:rPr>
-            </w:pPr>
-          </w:p>
-        </w:tc>
-      </w:tr>
-      <w:tr>
-        <w:trPr>
-          <w:trHeight w:hRule="exact" w:val="340"/>
-          <w:jc w:val="right"/>
-        </w:trPr>
-        <w:tc>
-          <w:tcPr>
-            <w:tcW w:w="979" w:type="dxa"/>
-            <w:gridSpan w:val="2"/>
-            <w:shd w:val="clear" w:color="auto" w:fill="DAEAF5"/>
-            <w:noWrap/>
-            <w:tcMar>
-              <w:top w:w="79" w:type="dxa"/>
-              <w:left w:w="57" w:type="dxa"/>
-              <w:bottom w:w="79" w:type="dxa"/>
-              <w:right w:w="57" w:type="dxa"/>
-            </w:tcMar>
-            <w:vAlign w:val="center"/>
-          </w:tcPr>
-          <w:p>
-            <w:pPr>
-              <w:rPr>
-                <w:rFonts w:ascii="Calibri" w:eastAsia="Calibri" w:hAnsi="Calibri" w:cs="Calibri"/>
-                <w:color w:val="005B8C"/>
-                <w:sz w:val="20"/>
-                <w:szCs w:val="20"/>
-              </w:rPr>
-            </w:pPr>
-            <w:r>
-              <w:rPr>
-                <w:rFonts w:ascii="Calibri" w:eastAsia="Calibri" w:hAnsi="Calibri" w:cs="Calibri"/>
-                <w:color w:val="005B8C"/>
-                <w:sz w:val="20"/>
-                <w:szCs w:val="20"/>
-              </w:rPr>
-              <w:t>Località:</w:t>
-            </w:r>
-          </w:p>
-        </w:tc>
-        <w:tc>
-          <w:tcPr>
-            <w:tcW w:w="9227" w:type="dxa"/>
-            <w:gridSpan w:val="33"/>
-            <w:noWrap/>
             <w:tcMar>
               <w:top w:w="79" w:type="dxa"/>
               <w:left w:w="57" w:type="dxa"/>

</xml_diff>